<commit_message>
Cartes Main à Récupération ou Cartes à Sélection d'Actions
</commit_message>
<xml_diff>
--- a/docs/systeme-de-cartes-a-jouer.docx
+++ b/docs/systeme-de-cartes-a-jouer.docx
@@ -8161,7 +8161,13 @@
               <w:jc w:val="center"/>
             </w:pPr>
             <w:r>
-              <w:t>Allocation de Points d’Action</w:t>
+              <w:t xml:space="preserve">Allocation de </w:t>
+            </w:r>
+            <w:r>
+              <w:t>Bonus</w:t>
+            </w:r>
+            <w:r>
+              <w:t xml:space="preserve"> d’Action</w:t>
             </w:r>
           </w:p>
         </w:tc>
@@ -8242,7 +8248,7 @@
               <w:jc w:val="center"/>
             </w:pPr>
             <w:r>
-              <w:t>Gestion de Main à récupération</w:t>
+              <w:t>Cartes de Sélection d’Actions</w:t>
             </w:r>
           </w:p>
         </w:tc>
@@ -8253,7 +8259,13 @@
           </w:tcPr>
           <w:p>
             <w:r>
-              <w:t xml:space="preserve">A chaque round (tour de table ) un crédit de 1, 2, 3 est tiré au dé + à son tour, chaque joueur joue des cartes (avec coût) pour un total de 3 crédits + à la fin de son tour, les cartes jouées sont récupérées, </w:t>
+              <w:t xml:space="preserve">A chaque round (tour de </w:t>
+            </w:r>
+            <w:r>
+              <w:t>table)</w:t>
+            </w:r>
+            <w:r>
+              <w:t xml:space="preserve"> un crédit de 1, 2, 3 est tiré au dé + à son tour, chaque joueur joue des cartes (avec coût) pour un total de 3 crédits + à la fin de son tour, les cartes jouées sont récupérées, </w:t>
             </w:r>
             <w:r>
               <w:t>les cartes puissantes</w:t>

</xml_diff>

<commit_message>
Nouvelle carte mémo + piste de score
</commit_message>
<xml_diff>
--- a/docs/systeme-de-cartes-a-jouer.docx
+++ b/docs/systeme-de-cartes-a-jouer.docx
@@ -974,8 +974,13 @@
         </w:numPr>
       </w:pPr>
       <w:r>
-        <w:t>Standard European</w:t>
+        <w:t xml:space="preserve">Standard </w:t>
       </w:r>
+      <w:proofErr w:type="spellStart"/>
+      <w:r>
+        <w:t>European</w:t>
+      </w:r>
+      <w:proofErr w:type="spellEnd"/>
       <w:r>
         <w:t xml:space="preserve"> : </w:t>
       </w:r>
@@ -992,7 +997,15 @@
         </w:numPr>
       </w:pPr>
       <w:r>
-        <w:t>Mini European : 44 x 68 mm</w:t>
+        <w:t xml:space="preserve">Mini </w:t>
+      </w:r>
+      <w:proofErr w:type="spellStart"/>
+      <w:r>
+        <w:t>European</w:t>
+      </w:r>
+      <w:proofErr w:type="spellEnd"/>
+      <w:r>
+        <w:t xml:space="preserve"> : 44 x 68 mm</w:t>
       </w:r>
     </w:p>
     <w:p>
@@ -8259,13 +8272,43 @@
           </w:tcPr>
           <w:p>
             <w:r>
-              <w:t xml:space="preserve">A chaque round (tour de </w:t>
-            </w:r>
-            <w:r>
-              <w:t>table)</w:t>
-            </w:r>
-            <w:r>
-              <w:t xml:space="preserve"> un crédit de 1, 2, 3 est tiré au dé + à son tour, chaque joueur joue des cartes (avec coût) pour un total de 3 crédits + à la fin de son tour, les cartes jouées sont récupérées, </w:t>
+              <w:t xml:space="preserve">A </w:t>
+            </w:r>
+            <w:r>
+              <w:t>son</w:t>
+            </w:r>
+            <w:r>
+              <w:t xml:space="preserve"> </w:t>
+            </w:r>
+            <w:r>
+              <w:t>tour,</w:t>
+            </w:r>
+            <w:r>
+              <w:t xml:space="preserve"> </w:t>
+            </w:r>
+            <w:r>
+              <w:t xml:space="preserve">chaque joueur tire au dé </w:t>
+            </w:r>
+            <w:r>
+              <w:t>un crédit de 1, 2, 3</w:t>
+            </w:r>
+            <w:r>
+              <w:t> ;</w:t>
+            </w:r>
+            <w:r>
+              <w:t xml:space="preserve"> </w:t>
+            </w:r>
+            <w:r>
+              <w:t>puis il</w:t>
+            </w:r>
+            <w:r>
+              <w:t xml:space="preserve"> joue des cartes</w:t>
+            </w:r>
+            <w:r>
+              <w:t xml:space="preserve"> de sa main</w:t>
+            </w:r>
+            <w:r>
+              <w:t xml:space="preserve"> (avec coût) pour un total de 3 crédits + à la fin de son tour, les cartes jouées sont récupérées, </w:t>
             </w:r>
             <w:r>
               <w:t>les cartes puissantes</w:t>

</xml_diff>

<commit_message>
Simulation pour le mode solo
</commit_message>
<xml_diff>
--- a/docs/systeme-de-cartes-a-jouer.docx
+++ b/docs/systeme-de-cartes-a-jouer.docx
@@ -9360,6 +9360,30 @@
         <w:pStyle w:val="Paragraphedeliste"/>
       </w:pPr>
     </w:p>
+    <w:p>
+      <w:r>
+        <w:t xml:space="preserve">Evaluation pour une partie en </w:t>
+      </w:r>
+      <w:r>
+        <w:rPr>
+          <w:b/>
+          <w:bCs/>
+        </w:rPr>
+        <w:t>solo</w:t>
+      </w:r>
+      <w:r>
+        <w:t> :</w:t>
+      </w:r>
+      <w:r>
+        <w:t xml:space="preserve"> 3</w:t>
+      </w:r>
+      <w:r>
+        <w:t>2</w:t>
+      </w:r>
+      <w:r>
+        <w:t xml:space="preserve"> points</w:t>
+      </w:r>
+    </w:p>
     <w:p/>
     <w:p/>
     <w:sectPr>

</xml_diff>